<commit_message>
RESHIPPED (task261): the book asks re-cut on silent devices, the call held
cracker.py, run on the strict battery, kept all nine Ask A figures and
Ask B's three household counts: the PDS reversion, the partner
nominations and the merges are documented handling a careful solver
executes. Ask A is now held by a member's totals printed on each of
the member's pension rows (36 members, 12 in every group, beside 21
whose rows genuinely differ) and by six partners whose 2026 death the
annuity listing records but the client register does not. Ask B's
households are held by former partners still named on six
reversionary annuities. The cracker keeps 0 of 15, pair ceiling 37.0.

Five segments unchanged. checks 253, verify (43 figures), two builds
byte-identical, figures_check 198 of 198, precut 50 of 50. Judge pass
3 DETERMINISTIC, APPROVE; reader clean.

Co-Authored-By: Claude Opus 5.5 <noreply@anthropic.com>
Claude-Session: https://claude.ai/code/session_0142Jt4Mt622iBfGoK24ivCU
</commit_message>
<xml_diff>
--- a/task261/golden/retirement_segments_2027.docx
+++ b/task261/golden/retirement_segments_2027.docx
@@ -902,7 +902,7 @@
         <w:spacing w:after="100"/>
       </w:pPr>
       <w:r>
-        <w:t>Placed the same way, by the older partner's age at 31 December 2026, our Retirement Income Account and lifetime annuity customers sit as below. A pension whose member died before 31 December with a reversionary beneficiary nominated is counted with the survivor, to whom it continued; a partner who is not our client is placed from the date of birth on the member's nomination.</w:t>
+        <w:t>Placed the same way, by the older partner's age at 31 December 2026, our Retirement Income Account and lifetime annuity customers sit as below. A pension whose member died before 31 December with a reversionary beneficiary nominated is counted with the survivor, to whom it continued; a partner who is not our client is placed from the date of birth on the member's nomination; a partner whose death in 2026 the annuity system recorded is not counted, though the register still holds them; and a member with two pensions is counted once, the extract printing the member's balance and payment on each of them. A former partner still named on an annuity is not paid while the annuitant lives.</w:t>
       </w:r>
     </w:p>
     <w:tbl>
@@ -1001,7 +1001,7 @@
               <w:jc w:val="right"/>
             </w:pPr>
             <w:r>
-              <w:t>442</w:t>
+              <w:t>445</w:t>
             </w:r>
           </w:p>
         </w:tc>
@@ -1014,7 +1014,7 @@
               <w:jc w:val="right"/>
             </w:pPr>
             <w:r>
-              <w:t>$207,655,000</w:t>
+              <w:t>$210,509,000</w:t>
             </w:r>
           </w:p>
         </w:tc>
@@ -1027,7 +1027,7 @@
               <w:jc w:val="right"/>
             </w:pPr>
             <w:r>
-              <w:t>$11,448,000</w:t>
+              <w:t>$11,589,000</w:t>
             </w:r>
           </w:p>
         </w:tc>
@@ -1040,7 +1040,7 @@
               <w:jc w:val="right"/>
             </w:pPr>
             <w:r>
-              <w:t>176</w:t>
+              <w:t>179</w:t>
             </w:r>
           </w:p>
         </w:tc>
@@ -1053,7 +1053,7 @@
               <w:jc w:val="right"/>
             </w:pPr>
             <w:r>
-              <w:t>$3,606,000</w:t>
+              <w:t>$3,653,000</w:t>
             </w:r>
           </w:p>
         </w:tc>
@@ -1078,7 +1078,7 @@
               <w:jc w:val="right"/>
             </w:pPr>
             <w:r>
-              <w:t>1,168</w:t>
+              <w:t>1,169</w:t>
             </w:r>
           </w:p>
         </w:tc>
@@ -1091,7 +1091,7 @@
               <w:jc w:val="right"/>
             </w:pPr>
             <w:r>
-              <w:t>$520,479,000</w:t>
+              <w:t>$521,126,000</w:t>
             </w:r>
           </w:p>
         </w:tc>
@@ -1104,7 +1104,7 @@
               <w:jc w:val="right"/>
             </w:pPr>
             <w:r>
-              <w:t>$30,320,000</w:t>
+              <w:t>$30,350,000</w:t>
             </w:r>
           </w:p>
         </w:tc>
@@ -1117,7 +1117,7 @@
               <w:jc w:val="right"/>
             </w:pPr>
             <w:r>
-              <w:t>467</w:t>
+              <w:t>468</w:t>
             </w:r>
           </w:p>
         </w:tc>
@@ -1130,7 +1130,7 @@
               <w:jc w:val="right"/>
             </w:pPr>
             <w:r>
-              <w:t>$9,011,000</w:t>
+              <w:t>$9,041,000</w:t>
             </w:r>
           </w:p>
         </w:tc>
@@ -1155,7 +1155,7 @@
               <w:jc w:val="right"/>
             </w:pPr>
             <w:r>
-              <w:t>746</w:t>
+              <w:t>742</w:t>
             </w:r>
           </w:p>
         </w:tc>
@@ -1168,7 +1168,7 @@
               <w:jc w:val="right"/>
             </w:pPr>
             <w:r>
-              <w:t>$249,568,000</w:t>
+              <w:t>$249,685,000</w:t>
             </w:r>
           </w:p>
         </w:tc>
@@ -1181,7 +1181,7 @@
               <w:jc w:val="right"/>
             </w:pPr>
             <w:r>
-              <w:t>$17,994,000</w:t>
+              <w:t>$18,003,000</w:t>
             </w:r>
           </w:p>
         </w:tc>
@@ -1194,7 +1194,7 @@
               <w:jc w:val="right"/>
             </w:pPr>
             <w:r>
-              <w:t>284</w:t>
+              <w:t>280</w:t>
             </w:r>
           </w:p>
         </w:tc>
@@ -1207,7 +1207,7 @@
               <w:jc w:val="right"/>
             </w:pPr>
             <w:r>
-              <w:t>$5,614,000</w:t>
+              <w:t>$5,510,000</w:t>
             </w:r>
           </w:p>
         </w:tc>

</xml_diff>